<commit_message>
docs(guides): update source edit deadline and review rules
Source self-edit is open until 12/10/2026 in the consumption source and
member guide part 2. The review guide now says completed contracts can
be approved directly.
</commit_message>
<xml_diff>
--- a/docs/huong-dan/nguon-tieu-thu/Huong-dan-nguon-tieu-thu.docx
+++ b/docs/huong-dan/nguon-tieu-thu/Huong-dan-nguon-tieu-thu.docx
@@ -594,7 +594,7 @@
         <w:pageBreakBefore/>
       </w:pPr>
       <w:r>
-        <w:t xml:space="preserve">4. Mở lần giao cần sửa nguồn (đến hết 08/10/2026)</w:t>
+        <w:t xml:space="preserve">4. Mở lần giao cần sửa nguồn (đến hết 12/10/2026)</w:t>
       </w:r>
     </w:p>
     <w:p>
@@ -832,7 +832,7 @@
           <w:b/>
           <w:bCs/>
         </w:rPr>
-        <w:t xml:space="preserve">08/10/2026</w:t>
+        <w:t xml:space="preserve">12/10/2026</w:t>
       </w:r>
       <w:r>
         <w:t xml:space="preserve">. Sau đó, lần giao đã khoá phải gửi </w:t>
@@ -1726,7 +1726,7 @@
         <w:spacing w:after="80"/>
       </w:pPr>
       <w:r>
-        <w:t xml:space="preserve">Không thấy nút Sửa nguồn → Đã quá ngày 08/10/2026, hoặc lần giao chưa có Ngày giao. Lần giao đã khoá thì gửi Đề nghị sửa.</w:t>
+        <w:t xml:space="preserve">Không thấy nút Sửa nguồn → Đã quá ngày 12/10/2026, hoặc lần giao chưa có Ngày giao. Lần giao đã khoá thì gửi Đề nghị sửa.</w:t>
       </w:r>
     </w:p>
     <w:p>

</xml_diff>